<commit_message>
feat: Add Wolters Kluwer contract experience to resume web page and docx files
</commit_message>
<xml_diff>
--- a/web/Resumes/Andrew/Resume.docx
+++ b/web/Resumes/Andrew/Resume.docx
@@ -1125,13 +1125,181 @@
       </w:pPr>
       <w:r>
         <w:rPr>
+          <w:rFonts w:ascii="Raleway SemiBold" w:hAnsi="Raleway SemiBold"/>
+          <w:b/>
+          <w:sz w:val="20"/>
+        </w:rPr>
+        <w:t>Perl Developer (Contract) | APRIL 2026-AUGUST 2026</w:t>
+      </w:r>
+    </w:p>
+    <w:p>
+      <w:pPr>
+        <w:spacing w:lineRule="atLeast" w:line="280"/>
+        <w:textAlignment w:val="auto"/>
+        <w:rPr>
+          <w:rStyle w:val="span"/>
+          <w:rFonts w:ascii="Raleway SemiBold" w:hAnsi="Raleway SemiBold" w:eastAsia="Raleway SemiBold" w:cs="Raleway SemiBold"/>
+          <w:b/>
+          <w:bCs/>
+          <w:sz w:val="20"/>
+          <w:szCs w:val="20"/>
+        </w:rPr>
+      </w:pPr>
+      <w:r>
+        <w:rPr>
+          <w:rFonts w:ascii="Raleway SemiBold" w:hAnsi="Raleway SemiBold"/>
+          <w:b/>
+          <w:sz w:val="20"/>
+        </w:rPr>
+        <w:t>Wolters Kluwer | CA (Remote)</w:t>
+      </w:r>
+    </w:p>
+    <w:p>
+      <w:pPr>
+        <w:pStyle w:val="documentsinglecolumnli"/>
+        <w:numPr>
+          <w:ilvl w:val="0"/>
+          <w:numId w:val="14"/>
+        </w:numPr>
+        <w:spacing w:lineRule="atLeast" w:line="280" w:before="0" w:after="80"/>
+        <w:ind w:hanging="160" w:left="200"/>
+        <w:rPr>
+          <w:rStyle w:val="span"/>
+          <w:rFonts w:ascii="Raleway" w:hAnsi="Raleway" w:eastAsia="Raleway" w:cs="Raleway"/>
+          <w:color w:val="000000"/>
+          <w:sz w:val="20"/>
+          <w:szCs w:val="20"/>
+        </w:rPr>
+      </w:pPr>
+      <w:r>
+        <w:rPr>
+          <w:rFonts w:ascii="Raleway" w:hAnsi="Raleway"/>
+          <w:sz w:val="20"/>
+        </w:rPr>
+        <w:t>Maintained and debugged the legacy Ovid web application ecosystem (OvidUI, Ovidweb), managing backend Perl logic, database queries, and complex configuration files.</w:t>
+      </w:r>
+    </w:p>
+    <w:p>
+      <w:pPr>
+        <w:pStyle w:val="documentsinglecolumnli"/>
+        <w:numPr>
+          <w:ilvl w:val="0"/>
+          <w:numId w:val="14"/>
+        </w:numPr>
+        <w:spacing w:lineRule="atLeast" w:line="280" w:before="0" w:after="80"/>
+        <w:ind w:hanging="160" w:left="200"/>
+        <w:rPr>
+          <w:rStyle w:val="span"/>
+          <w:rFonts w:ascii="Raleway" w:hAnsi="Raleway" w:eastAsia="Raleway" w:cs="Raleway"/>
+          <w:color w:val="000000"/>
+          <w:sz w:val="20"/>
+          <w:szCs w:val="20"/>
+        </w:rPr>
+      </w:pPr>
+      <w:r>
+        <w:rPr>
+          <w:rFonts w:ascii="Raleway" w:hAnsi="Raleway"/>
+          <w:sz w:val="20"/>
+        </w:rPr>
+        <w:t>Diagnosed critical local-to-production environment parity mismatches, resolving out-of-sync CPAN dependencies and caching anomalies to prevent runtime failures during containerization efforts.</w:t>
+      </w:r>
+    </w:p>
+    <w:p>
+      <w:pPr>
+        <w:pStyle w:val="documentsinglecolumnli"/>
+        <w:numPr>
+          <w:ilvl w:val="0"/>
+          <w:numId w:val="14"/>
+        </w:numPr>
+        <w:spacing w:lineRule="atLeast" w:line="280" w:before="0" w:after="80"/>
+        <w:ind w:hanging="160" w:left="200"/>
+        <w:rPr>
+          <w:rStyle w:val="span"/>
+          <w:rFonts w:ascii="Raleway" w:hAnsi="Raleway" w:eastAsia="Raleway" w:cs="Raleway"/>
+          <w:color w:val="000000"/>
+          <w:sz w:val="20"/>
+          <w:szCs w:val="20"/>
+        </w:rPr>
+      </w:pPr>
+      <w:r>
+        <w:rPr>
+          <w:rFonts w:ascii="Raleway" w:hAnsi="Raleway"/>
+          <w:sz w:val="20"/>
+        </w:rPr>
+        <w:t>Refactored custom control scripts to resolve master-worker process leaks, cleanly terminating orphaned prefork process pairs and freeing bound network ports.</w:t>
+      </w:r>
+    </w:p>
+    <w:p>
+      <w:pPr>
+        <w:pStyle w:val="documentsinglecolumnli"/>
+        <w:numPr>
+          <w:ilvl w:val="0"/>
+          <w:numId w:val="14"/>
+        </w:numPr>
+        <w:spacing w:lineRule="atLeast" w:line="280" w:before="0" w:after="80"/>
+        <w:ind w:hanging="160" w:left="200"/>
+        <w:rPr>
+          <w:rStyle w:val="span"/>
+          <w:rFonts w:ascii="Raleway" w:hAnsi="Raleway" w:eastAsia="Raleway" w:cs="Raleway"/>
+          <w:color w:val="000000"/>
+          <w:sz w:val="20"/>
+          <w:szCs w:val="20"/>
+        </w:rPr>
+      </w:pPr>
+      <w:r>
+        <w:rPr>
+          <w:rFonts w:ascii="Raleway" w:hAnsi="Raleway"/>
+          <w:sz w:val="20"/>
+        </w:rPr>
+        <w:t>Identified and corrected restrictive system umask configurations (0027) causing HTTP 403 errors, automating permissions adjustments (0022) across shared accounts to improve development efficiency.</w:t>
+      </w:r>
+    </w:p>
+    <w:p>
+      <w:pPr>
+        <w:pStyle w:val="documentsinglecolumnli"/>
+        <w:numPr>
+          <w:ilvl w:val="0"/>
+          <w:numId w:val="14"/>
+        </w:numPr>
+        <w:spacing w:lineRule="atLeast" w:line="280" w:before="0" w:after="80"/>
+        <w:ind w:hanging="160" w:left="200"/>
+        <w:rPr>
+          <w:rStyle w:val="span"/>
+          <w:rFonts w:ascii="Raleway" w:hAnsi="Raleway" w:eastAsia="Raleway" w:cs="Raleway"/>
+          <w:color w:val="000000"/>
+          <w:sz w:val="20"/>
+          <w:szCs w:val="20"/>
+        </w:rPr>
+      </w:pPr>
+      <w:r>
+        <w:rPr>
+          <w:rFonts w:ascii="Raleway" w:hAnsi="Raleway"/>
+          <w:sz w:val="20"/>
+        </w:rPr>
+        <w:t>Proposed a containerized VPN solution to bypass workstation connectivity limitations and support non-Intel CPU architectures for distributed developers.</w:t>
+      </w:r>
+    </w:p>
+    <w:p>
+      <w:pPr>
+        <w:pStyle w:val="documentexpr-secjobtitle"/>
+        <w:spacing w:lineRule="atLeast" w:line="280"/>
+        <w:rPr>
+          <w:rFonts w:ascii="Raleway SemiBold" w:hAnsi="Raleway SemiBold" w:eastAsia="Raleway SemiBold" w:cs="Raleway SemiBold"/>
+          <w:b/>
+          <w:bCs/>
+          <w:sz w:val="20"/>
+          <w:szCs w:val="20"/>
+        </w:rPr>
+      </w:pPr>
+      <w:r>
+        <w:rPr>
           <w:rFonts w:eastAsia="Raleway SemiBold" w:cs="Raleway SemiBold" w:ascii="Raleway SemiBold" w:hAnsi="Raleway SemiBold"/>
           <w:b/>
           <w:bCs/>
           <w:sz w:val="20"/>
           <w:szCs w:val="20"/>
         </w:rPr>
-        <w:t>Perl Developer | OCTOBER 2021-CURRENT</w:t>
+        <w:t>Perl Developer | OCTOBER 2021-APRIL 2026</w:t>
       </w:r>
     </w:p>
     <w:p>

</xml_diff>